<commit_message>
chore: clean up code structure for improved organization and maintainability
</commit_message>
<xml_diff>
--- a/public/src/AccountabilityForms/ASSET ACCOUNTABILITY FORM - RETURN.docx
+++ b/public/src/AccountabilityForms/ASSET ACCOUNTABILITY FORM - RETURN.docx
@@ -987,9 +987,13 @@
   <w:p>
     <w:pPr>
       <w:pStyle w:val="NoSpacing"/>
+      <w:rPr>
+        <w:rFonts w:ascii="Glacial Indifference" w:hAnsi="Glacial Indifference"/>
+      </w:rPr>
     </w:pPr>
     <w:r>
       <w:rPr>
+        <w:rFonts w:ascii="Glacial Indifference" w:hAnsi="Glacial Indifference"/>
         <w:noProof/>
       </w:rPr>
       <w:drawing>
@@ -1058,10 +1062,14 @@
       </w:drawing>
     </w:r>
     <w:r>
+      <w:rPr>
+        <w:rFonts w:ascii="Glacial Indifference" w:hAnsi="Glacial Indifference"/>
+      </w:rPr>
       <w:t>I</w:t>
     </w:r>
     <w:r>
       <w:rPr>
+        <w:rFonts w:ascii="Glacial Indifference" w:hAnsi="Glacial Indifference"/>
         <w:u w:val="single"/>
       </w:rPr>
       <w:t xml:space="preserve">         __{name}__    </w:t>
@@ -1069,6 +1077,7 @@
     <w:proofErr w:type="gramStart"/>
     <w:r>
       <w:rPr>
+        <w:rFonts w:ascii="Glacial Indifference" w:hAnsi="Glacial Indifference"/>
         <w:u w:val="single"/>
       </w:rPr>
       <w:t xml:space="preserve">   (</w:t>
@@ -1076,6 +1085,7 @@
     <w:proofErr w:type="gramEnd"/>
     <w:r>
       <w:rPr>
+        <w:rFonts w:ascii="Glacial Indifference" w:hAnsi="Glacial Indifference"/>
         <w:b/>
         <w:bCs/>
       </w:rPr>
@@ -1084,23 +1094,34 @@
     <w:proofErr w:type="gramStart"/>
     <w:r>
       <w:rPr>
+        <w:rFonts w:ascii="Glacial Indifference" w:hAnsi="Glacial Indifference"/>
         <w:b/>
         <w:bCs/>
       </w:rPr>
       <w:t>Returner</w:t>
     </w:r>
     <w:r>
+      <w:rPr>
+        <w:rFonts w:ascii="Glacial Indifference" w:hAnsi="Glacial Indifference"/>
+      </w:rPr>
       <w:t xml:space="preserve">)   </w:t>
     </w:r>
     <w:proofErr w:type="gramEnd"/>
     <w:r>
+      <w:rPr>
+        <w:rFonts w:ascii="Glacial Indifference" w:hAnsi="Glacial Indifference"/>
+      </w:rPr>
       <w:t xml:space="preserve">    </w:t>
     </w:r>
     <w:r>
+      <w:rPr>
+        <w:rFonts w:ascii="Glacial Indifference" w:hAnsi="Glacial Indifference"/>
+      </w:rPr>
       <w:br/>
     </w:r>
     <w:r>
       <w:rPr>
+        <w:rFonts w:ascii="Glacial Indifference" w:hAnsi="Glacial Indifference"/>
         <w:b/>
         <w:bCs/>
         <w:color w:val="EE0000"/>
@@ -1112,6 +1133,7 @@
     <w:proofErr w:type="gramStart"/>
     <w:r>
       <w:rPr>
+        <w:rFonts w:ascii="Glacial Indifference" w:hAnsi="Glacial Indifference"/>
         <w:b/>
         <w:bCs/>
         <w:color w:val="EE0000"/>
@@ -1122,6 +1144,7 @@
     </w:r>
     <w:r>
       <w:rPr>
+        <w:rFonts w:ascii="Glacial Indifference" w:hAnsi="Glacial Indifference"/>
         <w:b/>
         <w:bCs/>
         <w:sz w:val="20"/>
@@ -1132,6 +1155,7 @@
     <w:proofErr w:type="gramEnd"/>
     <w:r>
       <w:rPr>
+        <w:rFonts w:ascii="Glacial Indifference" w:hAnsi="Glacial Indifference"/>
         <w:b/>
         <w:bCs/>
         <w:sz w:val="20"/>
@@ -1142,6 +1166,7 @@
     <w:proofErr w:type="gramStart"/>
     <w:r>
       <w:rPr>
+        <w:rFonts w:ascii="Glacial Indifference" w:hAnsi="Glacial Indifference"/>
         <w:b/>
         <w:bCs/>
         <w:sz w:val="20"/>
@@ -1150,17 +1175,27 @@
       <w:t>Unchecked}</w:t>
     </w:r>
     <w:r>
+      <w:rPr>
+        <w:rFonts w:ascii="Glacial Indifference" w:hAnsi="Glacial Indifference"/>
+      </w:rPr>
       <w:t>Hereby</w:t>
     </w:r>
     <w:proofErr w:type="gramEnd"/>
     <w:r>
+      <w:rPr>
+        <w:rFonts w:ascii="Glacial Indifference" w:hAnsi="Glacial Indifference"/>
+      </w:rPr>
       <w:t xml:space="preserve"> affirm that the assets detailed above have been returned in good working condition. Therefore, upon signing this accountability form, I relinquish any further responsibility associated with these assets. I have ensured careful handling throughout their possession and am now returning them.</w:t>
     </w:r>
     <w:r>
+      <w:rPr>
+        <w:rFonts w:ascii="Glacial Indifference" w:hAnsi="Glacial Indifference"/>
+      </w:rPr>
       <w:br/>
     </w:r>
     <w:r>
       <w:rPr>
+        <w:rFonts w:ascii="Glacial Indifference" w:hAnsi="Glacial Indifference"/>
         <w:b/>
         <w:bCs/>
         <w:color w:val="EE0000"/>
@@ -1172,6 +1207,7 @@
     <w:proofErr w:type="gramStart"/>
     <w:r>
       <w:rPr>
+        <w:rFonts w:ascii="Glacial Indifference" w:hAnsi="Glacial Indifference"/>
         <w:b/>
         <w:bCs/>
         <w:color w:val="EE0000"/>
@@ -1182,6 +1218,7 @@
     </w:r>
     <w:r>
       <w:rPr>
+        <w:rFonts w:ascii="Glacial Indifference" w:hAnsi="Glacial Indifference"/>
         <w:b/>
         <w:bCs/>
         <w:sz w:val="20"/>
@@ -1192,6 +1229,7 @@
     <w:proofErr w:type="gramEnd"/>
     <w:r>
       <w:rPr>
+        <w:rFonts w:ascii="Glacial Indifference" w:hAnsi="Glacial Indifference"/>
         <w:b/>
         <w:bCs/>
         <w:sz w:val="20"/>
@@ -1202,6 +1240,7 @@
     <w:proofErr w:type="gramStart"/>
     <w:r>
       <w:rPr>
+        <w:rFonts w:ascii="Glacial Indifference" w:hAnsi="Glacial Indifference"/>
         <w:b/>
         <w:bCs/>
         <w:sz w:val="20"/>
@@ -1210,18 +1249,30 @@
       <w:t>Unchecked}</w:t>
     </w:r>
     <w:r>
+      <w:rPr>
+        <w:rFonts w:ascii="Glacial Indifference" w:hAnsi="Glacial Indifference"/>
+      </w:rPr>
       <w:t>Confirm</w:t>
     </w:r>
     <w:proofErr w:type="gramEnd"/>
     <w:r>
+      <w:rPr>
+        <w:rFonts w:ascii="Glacial Indifference" w:hAnsi="Glacial Indifference"/>
+      </w:rPr>
       <w:t xml:space="preserve"> that the assets entrusted to me have reached the end of their useful life, and therefore, I bear no control or responsibility for their disposal.</w:t>
     </w:r>
   </w:p>
   <w:p>
     <w:pPr>
       <w:pStyle w:val="NoSpacing"/>
+      <w:rPr>
+        <w:rFonts w:ascii="Glacial Indifference" w:hAnsi="Glacial Indifference"/>
+      </w:rPr>
     </w:pPr>
     <w:r>
+      <w:rPr>
+        <w:rFonts w:ascii="Glacial Indifference" w:hAnsi="Glacial Indifference"/>
+      </w:rPr>
       <w:t>I</w:t>
     </w:r>
     <w:r>
@@ -1232,23 +1283,34 @@
       <w:t xml:space="preserve"> _JOHN ALBERT LAGO </w:t>
     </w:r>
     <w:r>
+      <w:rPr>
+        <w:rFonts w:ascii="Glacial Indifference" w:hAnsi="Glacial Indifference"/>
+      </w:rPr>
       <w:t>(</w:t>
     </w:r>
     <w:r>
       <w:rPr>
+        <w:rFonts w:ascii="Glacial Indifference" w:hAnsi="Glacial Indifference"/>
         <w:b/>
         <w:bCs/>
       </w:rPr>
       <w:t>Name of Approver</w:t>
     </w:r>
     <w:r>
+      <w:rPr>
+        <w:rFonts w:ascii="Glacial Indifference" w:hAnsi="Glacial Indifference"/>
+      </w:rPr>
       <w:t>)</w:t>
     </w:r>
     <w:r>
+      <w:rPr>
+        <w:rFonts w:ascii="Glacial Indifference" w:hAnsi="Glacial Indifference"/>
+      </w:rPr>
       <w:br/>
     </w:r>
     <w:r>
       <w:rPr>
+        <w:rFonts w:ascii="Glacial Indifference" w:hAnsi="Glacial Indifference"/>
         <w:b/>
         <w:bCs/>
         <w:color w:val="EE0000"/>
@@ -1260,6 +1322,7 @@
     <w:proofErr w:type="gramStart"/>
     <w:r>
       <w:rPr>
+        <w:rFonts w:ascii="Glacial Indifference" w:hAnsi="Glacial Indifference"/>
         <w:b/>
         <w:bCs/>
         <w:color w:val="EE0000"/>
@@ -1270,6 +1333,7 @@
     </w:r>
     <w:r>
       <w:rPr>
+        <w:rFonts w:ascii="Glacial Indifference" w:hAnsi="Glacial Indifference"/>
         <w:b/>
         <w:bCs/>
         <w:sz w:val="20"/>
@@ -1280,6 +1344,7 @@
     <w:proofErr w:type="gramEnd"/>
     <w:r>
       <w:rPr>
+        <w:rFonts w:ascii="Glacial Indifference" w:hAnsi="Glacial Indifference"/>
         <w:b/>
         <w:bCs/>
         <w:sz w:val="20"/>
@@ -1290,6 +1355,7 @@
     <w:proofErr w:type="gramStart"/>
     <w:r>
       <w:rPr>
+        <w:rFonts w:ascii="Glacial Indifference" w:hAnsi="Glacial Indifference"/>
         <w:b/>
         <w:bCs/>
         <w:sz w:val="20"/>
@@ -1298,17 +1364,27 @@
       <w:t>Unchecked}</w:t>
     </w:r>
     <w:r>
+      <w:rPr>
+        <w:rFonts w:ascii="Glacial Indifference" w:hAnsi="Glacial Indifference"/>
+      </w:rPr>
       <w:t>Hereby</w:t>
     </w:r>
     <w:proofErr w:type="gramEnd"/>
     <w:r>
+      <w:rPr>
+        <w:rFonts w:ascii="Glacial Indifference" w:hAnsi="Glacial Indifference"/>
+      </w:rPr>
       <w:t xml:space="preserve"> confirm that I have witnessed the working condition of the assets listed above and certify that they are being returned in good working order and will return the assets to the stock room. </w:t>
     </w:r>
     <w:r>
+      <w:rPr>
+        <w:rFonts w:ascii="Glacial Indifference" w:hAnsi="Glacial Indifference"/>
+      </w:rPr>
       <w:br/>
     </w:r>
     <w:r>
       <w:rPr>
+        <w:rFonts w:ascii="Glacial Indifference" w:hAnsi="Glacial Indifference"/>
         <w:b/>
         <w:bCs/>
         <w:color w:val="EE0000"/>
@@ -1320,6 +1396,7 @@
     <w:proofErr w:type="gramStart"/>
     <w:r>
       <w:rPr>
+        <w:rFonts w:ascii="Glacial Indifference" w:hAnsi="Glacial Indifference"/>
         <w:b/>
         <w:bCs/>
         <w:color w:val="EE0000"/>
@@ -1330,6 +1407,7 @@
     </w:r>
     <w:r>
       <w:rPr>
+        <w:rFonts w:ascii="Glacial Indifference" w:hAnsi="Glacial Indifference"/>
         <w:b/>
         <w:bCs/>
         <w:sz w:val="20"/>
@@ -1340,6 +1418,7 @@
     <w:proofErr w:type="gramEnd"/>
     <w:r>
       <w:rPr>
+        <w:rFonts w:ascii="Glacial Indifference" w:hAnsi="Glacial Indifference"/>
         <w:b/>
         <w:bCs/>
         <w:sz w:val="20"/>
@@ -1350,6 +1429,7 @@
     <w:proofErr w:type="gramStart"/>
     <w:r>
       <w:rPr>
+        <w:rFonts w:ascii="Glacial Indifference" w:hAnsi="Glacial Indifference"/>
         <w:b/>
         <w:bCs/>
         <w:sz w:val="20"/>
@@ -1358,14 +1438,21 @@
       <w:t>Unchecked}</w:t>
     </w:r>
     <w:r>
+      <w:rPr>
+        <w:rFonts w:ascii="Glacial Indifference" w:hAnsi="Glacial Indifference"/>
+      </w:rPr>
       <w:t>Have</w:t>
     </w:r>
     <w:proofErr w:type="gramEnd"/>
     <w:r>
+      <w:rPr>
+        <w:rFonts w:ascii="Glacial Indifference" w:hAnsi="Glacial Indifference"/>
+      </w:rPr>
       <w:t xml:space="preserve"> observed that the assets for disposal have reached the end of their useful life and will dispose of them accordingly.</w:t>
     </w:r>
     <w:r>
       <w:rPr>
+        <w:rFonts w:ascii="Glacial Indifference" w:hAnsi="Glacial Indifference"/>
         <w:noProof/>
       </w:rPr>
       <w:t xml:space="preserve"> </w:t>
@@ -1379,8 +1466,8 @@
       <w:tblLook w:val="04A0" w:firstRow="1" w:lastRow="0" w:firstColumn="1" w:lastColumn="0" w:noHBand="0" w:noVBand="1"/>
     </w:tblPr>
     <w:tblGrid>
-      <w:gridCol w:w="4501"/>
-      <w:gridCol w:w="4712"/>
+      <w:gridCol w:w="4514"/>
+      <w:gridCol w:w="4699"/>
     </w:tblGrid>
     <w:tr>
       <w:trPr>
@@ -1394,12 +1481,14 @@
           <w:pPr>
             <w:jc w:val="both"/>
             <w:rPr>
+              <w:rFonts w:ascii="Glacial Indifference" w:hAnsi="Glacial Indifference"/>
               <w:b/>
               <w:bCs/>
             </w:rPr>
           </w:pPr>
           <w:r>
             <w:rPr>
+              <w:rFonts w:ascii="Glacial Indifference" w:hAnsi="Glacial Indifference"/>
               <w:b/>
               <w:bCs/>
             </w:rPr>
@@ -1414,6 +1503,7 @@
         <w:p>
           <w:pPr>
             <w:rPr>
+              <w:rFonts w:ascii="Glacial Indifference" w:hAnsi="Glacial Indifference"/>
               <w:b/>
               <w:bCs/>
             </w:rPr>
@@ -1433,12 +1523,14 @@
           <w:pPr>
             <w:jc w:val="both"/>
             <w:rPr>
+              <w:rFonts w:ascii="Glacial Indifference" w:hAnsi="Glacial Indifference"/>
               <w:b/>
               <w:bCs/>
             </w:rPr>
           </w:pPr>
           <w:r>
             <w:rPr>
+              <w:rFonts w:ascii="Glacial Indifference" w:hAnsi="Glacial Indifference"/>
               <w:b/>
               <w:bCs/>
             </w:rPr>
@@ -1451,8 +1543,14 @@
           <w:tcW w:w="5961" w:type="dxa"/>
         </w:tcPr>
         <w:p>
+          <w:pPr>
+            <w:rPr>
+              <w:rFonts w:ascii="Glacial Indifference" w:hAnsi="Glacial Indifference"/>
+            </w:rPr>
+          </w:pPr>
           <w:r>
             <w:rPr>
+              <w:rFonts w:ascii="Glacial Indifference" w:hAnsi="Glacial Indifference"/>
               <w:noProof/>
             </w:rPr>
             <w:drawing>
@@ -1518,11 +1616,17 @@
   <w:p>
     <w:pPr>
       <w:pStyle w:val="Footer"/>
+      <w:rPr>
+        <w:rFonts w:ascii="Glacial Indifference" w:hAnsi="Glacial Indifference"/>
+      </w:rPr>
     </w:pPr>
   </w:p>
   <w:p>
     <w:pPr>
       <w:pStyle w:val="Footer"/>
+      <w:rPr>
+        <w:rFonts w:ascii="Glacial Indifference" w:hAnsi="Glacial Indifference"/>
+      </w:rPr>
     </w:pPr>
   </w:p>
 </w:ftr>

</xml_diff>